<commit_message>
chore: cv.pdf com o coringa de 21/10/2026 (resumo novo, Agio front-end)
Co-Authored-By: Claude Opus 5.5 <noreply@anthropic.com>
</commit_message>
<xml_diff>
--- a/curriculo/cv.docx
+++ b/curriculo/cv.docx
@@ -46,7 +46,7 @@
         </w:rPr>
         <w:t xml:space="preserve">Caratinga, MG  |  +55 33 99853-1528  |  </w:t>
       </w:r>
-      <w:hyperlink w:history="1" r:id="rIdbuwmlvnhx8nkcwptvdm_a">
+      <w:hyperlink w:history="1" r:id="rId3joinoaytcndiplziqy_k">
         <w:r>
           <w:rPr>
             <w:rFonts w:ascii="Arial" w:cs="Arial" w:eastAsia="Arial" w:hAnsi="Arial"/>
@@ -71,7 +71,7 @@
         </w:rPr>
         <w:t xml:space="preserve">Portfólio: </w:t>
       </w:r>
-      <w:hyperlink w:history="1" r:id="rIdwzdlpfy-nylq9uxuizkj7">
+      <w:hyperlink w:history="1" r:id="rIdjgayodsfxjx_ps2mnvobn">
         <w:r>
           <w:rPr>
             <w:rFonts w:ascii="Arial" w:cs="Arial" w:eastAsia="Arial" w:hAnsi="Arial"/>
@@ -90,7 +90,7 @@
         </w:rPr>
         <w:t xml:space="preserve">  |  LinkedIn: </w:t>
       </w:r>
-      <w:hyperlink w:history="1" r:id="rIdsvwxxije2gpn9lwyydak_">
+      <w:hyperlink w:history="1" r:id="rIdgufcc6oquv4v3kgpdrju8">
         <w:r>
           <w:rPr>
             <w:rFonts w:ascii="Arial" w:cs="Arial" w:eastAsia="Arial" w:hAnsi="Arial"/>
@@ -109,7 +109,7 @@
         </w:rPr>
         <w:t xml:space="preserve">  |  GitHub: </w:t>
       </w:r>
-      <w:hyperlink w:history="1" r:id="rIdob13jguryxsccs1z5-io_">
+      <w:hyperlink w:history="1" r:id="rIdtajqjk-vxfupnkkwazij5">
         <w:r>
           <w:rPr>
             <w:rFonts w:ascii="Arial" w:cs="Arial" w:eastAsia="Arial" w:hAnsi="Arial"/>
@@ -151,7 +151,7 @@
           <w:sz w:val="20"/>
           <w:szCs w:val="20"/>
         </w:rPr>
-        <w:t xml:space="preserve">Desenvolvedor full stack que entrega produto de ponta a ponta, do banco de dados à interface e do requisito ao deploy. Trabalho com React, Angular, Node.js e Java, e uso IA no dia a dia para entregar mais rápido e com qualidade.</w:t>
+        <w:t xml:space="preserve">Sou desenvolvedor full stack e gosto de acompanhar uma funcionalidade do requisito até o deploy. Trabalho com React, Angular, Node.js e Java, escrevo testes para o que entrego e uso IA no dia a dia como ferramenta, sempre revisando o resultado.</w:t>
       </w:r>
     </w:p>
     <w:p>
@@ -240,7 +240,7 @@
           <w:sz w:val="20"/>
           <w:szCs w:val="20"/>
         </w:rPr>
-        <w:t xml:space="preserve">Node.js, NestJS, APIs REST, Spring Boot, Spring Data JPA, Bean Validation</w:t>
+        <w:t xml:space="preserve">Node.js, NestJS, APIs REST, Spring Boot, Spring Data JPA</w:t>
       </w:r>
     </w:p>
     <w:p>
@@ -286,7 +286,7 @@
           <w:sz w:val="20"/>
           <w:szCs w:val="20"/>
         </w:rPr>
-        <w:t xml:space="preserve">PostgreSQL, Prisma, Flyway, Maven, Redis, Docker, GitHub Actions (CI/CD)</w:t>
+        <w:t xml:space="preserve">PostgreSQL, SQL, Prisma, Flyway, Maven, Redis, Docker, GitHub Actions (CI/CD), AWS (S3, SES)</w:t>
       </w:r>
     </w:p>
     <w:p>
@@ -309,7 +309,7 @@
           <w:sz w:val="20"/>
           <w:szCs w:val="20"/>
         </w:rPr>
-        <w:t xml:space="preserve">Claude Code, GitHub Copilot, testes unitários e de integração, Jest, Vitest, Git, code review</w:t>
+        <w:t xml:space="preserve">Claude Code, GitHub Copilot, testes unitários e de integração, Jest, Git, code review</w:t>
       </w:r>
     </w:p>
     <w:p>
@@ -517,7 +517,7 @@
           <w:sz w:val="21"/>
           <w:szCs w:val="21"/>
         </w:rPr>
-        <w:t xml:space="preserve">Desenvolvedor de Software</w:t>
+        <w:t xml:space="preserve">Desenvolvedor Front-End</w:t>
       </w:r>
       <w:r>
         <w:rPr>
@@ -729,7 +729,7 @@
         </w:rPr>
         <w:t xml:space="preserve">  -  </w:t>
       </w:r>
-      <w:hyperlink w:history="1" r:id="rId21sjdnjbi5n5pityrqnad">
+      <w:hyperlink w:history="1" r:id="rIduo7_3rwdvhxeqpebzmkxw">
         <w:r>
           <w:rPr>
             <w:rFonts w:ascii="Arial" w:cs="Arial" w:eastAsia="Arial" w:hAnsi="Arial"/>
@@ -782,7 +782,7 @@
         </w:rPr>
         <w:t xml:space="preserve">  -  </w:t>
       </w:r>
-      <w:hyperlink w:history="1" r:id="rIdrl3-a-mzrzowtoc3qkzdl">
+      <w:hyperlink w:history="1" r:id="rIdjkg--nqb_suom03ntooho">
         <w:r>
           <w:rPr>
             <w:rFonts w:ascii="Arial" w:cs="Arial" w:eastAsia="Arial" w:hAnsi="Arial"/>

</xml_diff>

<commit_message>
chore: cv.pdf com o coringa de 23/10/2026
Resumo profissional, bullets em ação + método + resultado, 7 categorias de
competências, demo nos projetos e Arial embutida no PDF.

Co-Authored-By: Claude Opus 5.5 <noreply@anthropic.com>
</commit_message>
<xml_diff>
--- a/curriculo/cv.docx
+++ b/curriculo/cv.docx
@@ -46,7 +46,7 @@
         </w:rPr>
         <w:t xml:space="preserve">Caratinga, MG  |  +55 33 99853-1528  |  </w:t>
       </w:r>
-      <w:hyperlink w:history="1" r:id="rId3joinoaytcndiplziqy_k">
+      <w:hyperlink w:history="1" r:id="rIdkn-m96pvrux9vynbvn6jt">
         <w:r>
           <w:rPr>
             <w:rFonts w:ascii="Arial" w:cs="Arial" w:eastAsia="Arial" w:hAnsi="Arial"/>
@@ -71,7 +71,7 @@
         </w:rPr>
         <w:t xml:space="preserve">Portfólio: </w:t>
       </w:r>
-      <w:hyperlink w:history="1" r:id="rIdjgayodsfxjx_ps2mnvobn">
+      <w:hyperlink w:history="1" r:id="rIdhaueifzop1jjcsdbinvay">
         <w:r>
           <w:rPr>
             <w:rFonts w:ascii="Arial" w:cs="Arial" w:eastAsia="Arial" w:hAnsi="Arial"/>
@@ -90,7 +90,7 @@
         </w:rPr>
         <w:t xml:space="preserve">  |  LinkedIn: </w:t>
       </w:r>
-      <w:hyperlink w:history="1" r:id="rIdgufcc6oquv4v3kgpdrju8">
+      <w:hyperlink w:history="1" r:id="rIde-z-_gvyizovb8gs5tdrl">
         <w:r>
           <w:rPr>
             <w:rFonts w:ascii="Arial" w:cs="Arial" w:eastAsia="Arial" w:hAnsi="Arial"/>
@@ -109,7 +109,7 @@
         </w:rPr>
         <w:t xml:space="preserve">  |  GitHub: </w:t>
       </w:r>
-      <w:hyperlink w:history="1" r:id="rIdtajqjk-vxfupnkkwazij5">
+      <w:hyperlink w:history="1" r:id="rIdza1lxcesrhfqoeltfcvdj">
         <w:r>
           <w:rPr>
             <w:rFonts w:ascii="Arial" w:cs="Arial" w:eastAsia="Arial" w:hAnsi="Arial"/>
@@ -151,7 +151,7 @@
           <w:sz w:val="20"/>
           <w:szCs w:val="20"/>
         </w:rPr>
-        <w:t xml:space="preserve">Sou desenvolvedor full stack e gosto de acompanhar uma funcionalidade do requisito até o deploy. Trabalho com React, Angular, Node.js e Java, escrevo testes para o que entrego e uso IA no dia a dia como ferramenta, sempre revisando o resultado.</w:t>
+        <w:t xml:space="preserve">Desenvolvedor Full Stack com experiência no desenvolvimento e na evolução de produtos digitais em produção. Trabalho com Node.js e React no dia a dia e com Java/Spring Boot e Angular em projetos próprios, da implementação aos testes e à publicação, usando IA como apoio e revisando o resultado.</w:t>
       </w:r>
     </w:p>
     <w:p>
@@ -194,7 +194,7 @@
           <w:sz w:val="20"/>
           <w:szCs w:val="20"/>
         </w:rPr>
-        <w:t xml:space="preserve">TypeScript, JavaScript, Java</w:t>
+        <w:t xml:space="preserve">TypeScript, JavaScript, Java, SQL</w:t>
       </w:r>
     </w:p>
     <w:p>
@@ -255,15 +255,15 @@
           <w:sz w:val="20"/>
           <w:szCs w:val="20"/>
         </w:rPr>
-        <w:t xml:space="preserve">Arquitetura: </w:t>
-      </w:r>
-      <w:r>
-        <w:rPr>
-          <w:rFonts w:ascii="Arial" w:cs="Arial" w:eastAsia="Arial" w:hAnsi="Arial"/>
-          <w:sz w:val="20"/>
-          <w:szCs w:val="20"/>
-        </w:rPr>
-        <w:t xml:space="preserve">Clean Architecture, Microfrontends, Monorepo (Turborepo), Design Patterns</w:t>
+        <w:t xml:space="preserve">Dados: </w:t>
+      </w:r>
+      <w:r>
+        <w:rPr>
+          <w:rFonts w:ascii="Arial" w:cs="Arial" w:eastAsia="Arial" w:hAnsi="Arial"/>
+          <w:sz w:val="20"/>
+          <w:szCs w:val="20"/>
+        </w:rPr>
+        <w:t xml:space="preserve">PostgreSQL, Prisma, Flyway, Redis</w:t>
       </w:r>
     </w:p>
     <w:p>
@@ -278,15 +278,15 @@
           <w:sz w:val="20"/>
           <w:szCs w:val="20"/>
         </w:rPr>
-        <w:t xml:space="preserve">Dados e infraestrutura: </w:t>
-      </w:r>
-      <w:r>
-        <w:rPr>
-          <w:rFonts w:ascii="Arial" w:cs="Arial" w:eastAsia="Arial" w:hAnsi="Arial"/>
-          <w:sz w:val="20"/>
-          <w:szCs w:val="20"/>
-        </w:rPr>
-        <w:t xml:space="preserve">PostgreSQL, SQL, Prisma, Flyway, Maven, Redis, Docker, GitHub Actions (CI/CD), AWS (S3, SES)</w:t>
+        <w:t xml:space="preserve">Cloud e DevOps: </w:t>
+      </w:r>
+      <w:r>
+        <w:rPr>
+          <w:rFonts w:ascii="Arial" w:cs="Arial" w:eastAsia="Arial" w:hAnsi="Arial"/>
+          <w:sz w:val="20"/>
+          <w:szCs w:val="20"/>
+        </w:rPr>
+        <w:t xml:space="preserve">AWS (EC2, RDS, S3, SES), Docker, GitHub Actions (CI/CD), Sentry, Monorepo (Turborepo)</w:t>
       </w:r>
     </w:p>
     <w:p>
@@ -301,15 +301,38 @@
           <w:sz w:val="20"/>
           <w:szCs w:val="20"/>
         </w:rPr>
-        <w:t xml:space="preserve">IA, qualidade e processo: </w:t>
-      </w:r>
-      <w:r>
-        <w:rPr>
-          <w:rFonts w:ascii="Arial" w:cs="Arial" w:eastAsia="Arial" w:hAnsi="Arial"/>
-          <w:sz w:val="20"/>
-          <w:szCs w:val="20"/>
-        </w:rPr>
-        <w:t xml:space="preserve">Claude Code, GitHub Copilot, testes unitários e de integração, Jest, Git, code review</w:t>
+        <w:t xml:space="preserve">Testes e qualidade: </w:t>
+      </w:r>
+      <w:r>
+        <w:rPr>
+          <w:rFonts w:ascii="Arial" w:cs="Arial" w:eastAsia="Arial" w:hAnsi="Arial"/>
+          <w:sz w:val="20"/>
+          <w:szCs w:val="20"/>
+        </w:rPr>
+        <w:t xml:space="preserve">testes unitários e de integração, Jest, Vitest, JUnit 5, Mockito, code review</w:t>
+      </w:r>
+    </w:p>
+    <w:p>
+      <w:pPr>
+        <w:spacing w:after="28"/>
+      </w:pPr>
+      <w:r>
+        <w:rPr>
+          <w:rFonts w:ascii="Arial" w:cs="Arial" w:eastAsia="Arial" w:hAnsi="Arial"/>
+          <w:b/>
+          <w:bCs/>
+          <w:sz w:val="20"/>
+          <w:szCs w:val="20"/>
+        </w:rPr>
+        <w:t xml:space="preserve">Processo e IA: </w:t>
+      </w:r>
+      <w:r>
+        <w:rPr>
+          <w:rFonts w:ascii="Arial" w:cs="Arial" w:eastAsia="Arial" w:hAnsi="Arial"/>
+          <w:sz w:val="20"/>
+          <w:szCs w:val="20"/>
+        </w:rPr>
+        <w:t xml:space="preserve">Git, Scrum, Claude Code</w:t>
       </w:r>
     </w:p>
     <w:p>
@@ -403,7 +426,7 @@
           <w:sz w:val="20"/>
           <w:szCs w:val="20"/>
         </w:rPr>
-        <w:t xml:space="preserve">Construí sozinho a plataforma de educação da empresa, hoje em produção: a API que sustenta o produto inteiro e as 3 aplicações usadas por alunos, professores e equipe.</w:t>
+        <w:t xml:space="preserve">Desenvolvi sozinho a API central e as 3 aplicações para alunos, professores e equipe, levando a plataforma de educação à produção.</w:t>
       </w:r>
     </w:p>
     <w:p>
@@ -422,7 +445,7 @@
           <w:sz w:val="20"/>
           <w:szCs w:val="20"/>
         </w:rPr>
-        <w:t xml:space="preserve">Mantenho o produto estável com mais de 670 arquivos de testes automatizados rodando a cada entrega, o que evita que uma mudança quebre o que o aluno já usa.</w:t>
+        <w:t xml:space="preserve">Mantenho uma suíte com mais de 670 arquivos de testes automatizados, executada a cada entrega para detectar regressões antes de chegarem ao aluno.</w:t>
       </w:r>
     </w:p>
     <w:p>
@@ -441,7 +464,7 @@
           <w:sz w:val="20"/>
           <w:szCs w:val="20"/>
         </w:rPr>
-        <w:t xml:space="preserve">Implementei a cobrança do produto com 2 meios de pagamento: parcelamento em até 12x, PIX e boleto no Brasil e assinatura recorrente em moeda estrangeira, o que permite vender para clientes no exterior.</w:t>
+        <w:t xml:space="preserve">Implementei a cobrança no Brasil com parcelamento em até 12x, PIX e boleto, e a assinatura recorrente internacional em moeda estrangeira, integrando 2 gateways (Stripe e InfinitePay).</w:t>
       </w:r>
     </w:p>
     <w:p>
@@ -460,7 +483,7 @@
           <w:sz w:val="20"/>
           <w:szCs w:val="20"/>
         </w:rPr>
-        <w:t xml:space="preserve">Entreguei a geração de flashcards por IA dentro do produto, um diferencial que cria material de estudo a partir do conteúdo que o aluno está estudando.</w:t>
+        <w:t xml:space="preserve">Integrei a geração de flashcards por IA ao fluxo de estudo, criando material a partir do conteúdo que o aluno está estudando.</w:t>
       </w:r>
     </w:p>
     <w:p>
@@ -479,7 +502,7 @@
           <w:sz w:val="20"/>
           <w:szCs w:val="20"/>
         </w:rPr>
-        <w:t xml:space="preserve">Garanti que cliente pagante não perdesse o acesso: reconciliação automática de pagamentos, correção do fluxo em que o aluno pagava e ficava bloqueado e adoção, pelo painel, de assinaturas feitas fora do app.</w:t>
+        <w:t xml:space="preserve">Corrigi falhas de reconciliação de pagamentos e de liberação de acesso, incluindo o caso em que o pagamento era aprovado e o aluno continuava bloqueado.</w:t>
       </w:r>
     </w:p>
     <w:p>
@@ -498,7 +521,7 @@
           <w:sz w:val="20"/>
           <w:szCs w:val="20"/>
         </w:rPr>
-        <w:t xml:space="preserve">Usei agentes de IA para refatorar o caso de uso mais crítico do checkout (de 994 para 184 linhas) em 6 PRs pequenos e protegidos por testes automatizados, sem parar o produto.</w:t>
+        <w:t xml:space="preserve">Refatorei com agentes de IA o caso de uso mais crítico do checkout, de 994 para 184 linhas, em 6 PRs protegidos por testes automatizados, separando as regras em funções testadas isoladamente.</w:t>
       </w:r>
     </w:p>
     <w:p>
@@ -572,7 +595,7 @@
           <w:sz w:val="20"/>
           <w:szCs w:val="20"/>
         </w:rPr>
-        <w:t xml:space="preserve">Conduzi 2 projetos do início à entrega, gerenciando 3 repositórios, e contribuí em outros 5 projetos do time.</w:t>
+        <w:t xml:space="preserve">Conduzi 2 projetos do início à entrega, uma aplicação web PWA em Next.js e um app mobile em React Native com Expo, gerenciando 3 repositórios, e contribuí em outros 5 projetos do time.</w:t>
       </w:r>
     </w:p>
     <w:p>
@@ -610,7 +633,7 @@
           <w:sz w:val="20"/>
           <w:szCs w:val="20"/>
         </w:rPr>
-        <w:t xml:space="preserve">Usei IA para acelerar entregas e testes em prazos apertados do cliente.</w:t>
+        <w:t xml:space="preserve">Traduzi os layouts do Figma em requisitos técnicos e componentes reaproveitáveis de front-end.</w:t>
       </w:r>
     </w:p>
     <w:p>
@@ -684,7 +707,7 @@
           <w:sz w:val="20"/>
           <w:szCs w:val="20"/>
         </w:rPr>
-        <w:t xml:space="preserve">Entreguei mais de 10 sites institucionais para clientes, do requisito à publicação.</w:t>
+        <w:t xml:space="preserve">Entreguei mais de 10 sites institucionais em WordPress e PHP, do requisito à publicação, com integrações a sistemas de terceiros que eliminaram etapas manuais dos clientes.</w:t>
       </w:r>
     </w:p>
     <w:p>
@@ -729,7 +752,7 @@
         </w:rPr>
         <w:t xml:space="preserve">  -  </w:t>
       </w:r>
-      <w:hyperlink w:history="1" r:id="rIduo7_3rwdvhxeqpebzmkxw">
+      <w:hyperlink w:history="1" r:id="rIdhmixmadcupb_tdxfw0lrt">
         <w:r>
           <w:rPr>
             <w:rFonts w:ascii="Arial" w:cs="Arial" w:eastAsia="Arial" w:hAnsi="Arial"/>
@@ -740,49 +763,68 @@
           <w:t xml:space="preserve">github.com/jonasmessias/angular-task-manager</w:t>
         </w:r>
       </w:hyperlink>
-    </w:p>
-    <w:p>
-      <w:pPr>
-        <w:pStyle w:val="ListParagraph"/>
-        <w:keepNext w:val="false"/>
-        <w:numPr>
-          <w:ilvl w:val="0"/>
-          <w:numId w:val="2"/>
-        </w:numPr>
-        <w:spacing w:after="36"/>
-      </w:pPr>
-      <w:r>
-        <w:rPr>
-          <w:rFonts w:ascii="Arial" w:cs="Arial" w:eastAsia="Arial" w:hAnsi="Arial"/>
-          <w:sz w:val="20"/>
-          <w:szCs w:val="20"/>
-        </w:rPr>
-        <w:t xml:space="preserve">Gerenciador de tarefas em formato Kanban feito em Angular, com login e sessão que se renova sozinha; é o front-end da API em Java abaixo.</w:t>
-      </w:r>
-    </w:p>
-    <w:p>
-      <w:pPr>
-        <w:spacing w:after="18" w:before="50"/>
-      </w:pPr>
-      <w:r>
-        <w:rPr>
-          <w:rFonts w:ascii="Arial" w:cs="Arial" w:eastAsia="Arial" w:hAnsi="Arial"/>
-          <w:b/>
-          <w:bCs/>
-          <w:sz w:val="20"/>
-          <w:szCs w:val="20"/>
-        </w:rPr>
-        <w:t xml:space="preserve">spring-task-manager-api</w:t>
-      </w:r>
       <w:r>
         <w:rPr>
           <w:rFonts w:ascii="Arial" w:cs="Arial" w:eastAsia="Arial" w:hAnsi="Arial"/>
           <w:sz w:val="18"/>
           <w:szCs w:val="18"/>
         </w:rPr>
+        <w:t xml:space="preserve">  |  Demo: </w:t>
+      </w:r>
+      <w:hyperlink w:history="1" r:id="rIddwietgkbywcdi_uo1gwin">
+        <w:r>
+          <w:rPr>
+            <w:rFonts w:ascii="Arial" w:cs="Arial" w:eastAsia="Arial" w:hAnsi="Arial"/>
+            <w:color w:val="000000"/>
+            <w:sz w:val="18"/>
+            <w:szCs w:val="18"/>
+          </w:rPr>
+          <w:t xml:space="preserve">task-manager-app-angular.vercel.app</w:t>
+        </w:r>
+      </w:hyperlink>
+    </w:p>
+    <w:p>
+      <w:pPr>
+        <w:pStyle w:val="ListParagraph"/>
+        <w:keepNext w:val="false"/>
+        <w:numPr>
+          <w:ilvl w:val="0"/>
+          <w:numId w:val="2"/>
+        </w:numPr>
+        <w:spacing w:after="36"/>
+      </w:pPr>
+      <w:r>
+        <w:rPr>
+          <w:rFonts w:ascii="Arial" w:cs="Arial" w:eastAsia="Arial" w:hAnsi="Arial"/>
+          <w:sz w:val="20"/>
+          <w:szCs w:val="20"/>
+        </w:rPr>
+        <w:t xml:space="preserve">Gerenciador de tarefas em formato Kanban feito em Angular, com login e sessão que se renova sozinha; é o front-end da API em Java abaixo.</w:t>
+      </w:r>
+    </w:p>
+    <w:p>
+      <w:pPr>
+        <w:spacing w:after="18" w:before="50"/>
+      </w:pPr>
+      <w:r>
+        <w:rPr>
+          <w:rFonts w:ascii="Arial" w:cs="Arial" w:eastAsia="Arial" w:hAnsi="Arial"/>
+          <w:b/>
+          <w:bCs/>
+          <w:sz w:val="20"/>
+          <w:szCs w:val="20"/>
+        </w:rPr>
+        <w:t xml:space="preserve">spring-task-manager-api</w:t>
+      </w:r>
+      <w:r>
+        <w:rPr>
+          <w:rFonts w:ascii="Arial" w:cs="Arial" w:eastAsia="Arial" w:hAnsi="Arial"/>
+          <w:sz w:val="18"/>
+          <w:szCs w:val="18"/>
+        </w:rPr>
         <w:t xml:space="preserve">  -  </w:t>
       </w:r>
-      <w:hyperlink w:history="1" r:id="rIdjkg--nqb_suom03ntooho">
+      <w:hyperlink w:history="1" r:id="rIdke80ihyesmk42d5njvjsb">
         <w:r>
           <w:rPr>
             <w:rFonts w:ascii="Arial" w:cs="Arial" w:eastAsia="Arial" w:hAnsi="Arial"/>
@@ -917,7 +959,7 @@
           <w:sz w:val="20"/>
           <w:szCs w:val="20"/>
         </w:rPr>
-        <w:t xml:space="preserve">Português (nativo); Inglês (intermediário a avançado, leitura técnica e conversação); Espanhol (básico).</w:t>
+        <w:t xml:space="preserve">Português (nativo); Inglês (intermediário); Espanhol (básico).</w:t>
       </w:r>
     </w:p>
     <w:sectPr>

</xml_diff>

<commit_message>
chore: cv.pdf com os bullets mais fortes (23/10/2026)
Migração do no-code e venda assistida no lugar de dois bullets fracos,
testes sem 'suíte', e linhas de projeto que mostram o que cada um tem.

Co-Authored-By: Claude Opus 5.5 <noreply@anthropic.com>
</commit_message>
<xml_diff>
--- a/curriculo/cv.docx
+++ b/curriculo/cv.docx
@@ -46,7 +46,7 @@
         </w:rPr>
         <w:t xml:space="preserve">Caratinga, MG  |  +55 33 99853-1528  |  </w:t>
       </w:r>
-      <w:hyperlink w:history="1" r:id="rIdkn-m96pvrux9vynbvn6jt">
+      <w:hyperlink w:history="1" r:id="rIdmc4ytukwovjommrbjhji0">
         <w:r>
           <w:rPr>
             <w:rFonts w:ascii="Arial" w:cs="Arial" w:eastAsia="Arial" w:hAnsi="Arial"/>
@@ -71,7 +71,7 @@
         </w:rPr>
         <w:t xml:space="preserve">Portfólio: </w:t>
       </w:r>
-      <w:hyperlink w:history="1" r:id="rIdhaueifzop1jjcsdbinvay">
+      <w:hyperlink w:history="1" r:id="rIdfvn5vaqdpvu781fm2tjuy">
         <w:r>
           <w:rPr>
             <w:rFonts w:ascii="Arial" w:cs="Arial" w:eastAsia="Arial" w:hAnsi="Arial"/>
@@ -90,7 +90,7 @@
         </w:rPr>
         <w:t xml:space="preserve">  |  LinkedIn: </w:t>
       </w:r>
-      <w:hyperlink w:history="1" r:id="rIde-z-_gvyizovb8gs5tdrl">
+      <w:hyperlink w:history="1" r:id="rIdhecrurpudygsfy1c8kntg">
         <w:r>
           <w:rPr>
             <w:rFonts w:ascii="Arial" w:cs="Arial" w:eastAsia="Arial" w:hAnsi="Arial"/>
@@ -109,7 +109,7 @@
         </w:rPr>
         <w:t xml:space="preserve">  |  GitHub: </w:t>
       </w:r>
-      <w:hyperlink w:history="1" r:id="rIdza1lxcesrhfqoeltfcvdj">
+      <w:hyperlink w:history="1" r:id="rIdrz5dg2v1rc2n-54azzgpa">
         <w:r>
           <w:rPr>
             <w:rFonts w:ascii="Arial" w:cs="Arial" w:eastAsia="Arial" w:hAnsi="Arial"/>
@@ -445,7 +445,7 @@
           <w:sz w:val="20"/>
           <w:szCs w:val="20"/>
         </w:rPr>
-        <w:t xml:space="preserve">Mantenho uma suíte com mais de 670 arquivos de testes automatizados, executada a cada entrega para detectar regressões antes de chegarem ao aluno.</w:t>
+        <w:t xml:space="preserve">Implementei a cobrança no Brasil com parcelamento em até 12x, PIX e boleto, e a assinatura recorrente internacional em moeda estrangeira, integrando 2 gateways (Stripe e InfinitePay).</w:t>
       </w:r>
     </w:p>
     <w:p>
@@ -464,7 +464,7 @@
           <w:sz w:val="20"/>
           <w:szCs w:val="20"/>
         </w:rPr>
-        <w:t xml:space="preserve">Implementei a cobrança no Brasil com parcelamento em até 12x, PIX e boleto, e a assinatura recorrente internacional em moeda estrangeira, integrando 2 gateways (Stripe e InfinitePay).</w:t>
+        <w:t xml:space="preserve">Corrigi falhas de reconciliação de pagamentos e de liberação de acesso, incluindo o caso em que o pagamento era aprovado e o aluno continuava bloqueado.</w:t>
       </w:r>
     </w:p>
     <w:p>
@@ -483,7 +483,7 @@
           <w:sz w:val="20"/>
           <w:szCs w:val="20"/>
         </w:rPr>
-        <w:t xml:space="preserve">Integrei a geração de flashcards por IA ao fluxo de estudo, criando material a partir do conteúdo que o aluno está estudando.</w:t>
+        <w:t xml:space="preserve">Desenvolvi a venda assistida (link público com QR Code PIX e validação de comprovante), que permite vender pelo WhatsApp sem o comprador ter cartão na hora.</w:t>
       </w:r>
     </w:p>
     <w:p>
@@ -502,7 +502,7 @@
           <w:sz w:val="20"/>
           <w:szCs w:val="20"/>
         </w:rPr>
-        <w:t xml:space="preserve">Corrigi falhas de reconciliação de pagamentos e de liberação de acesso, incluindo o caso em que o pagamento era aprovado e o aluno continuava bloqueado.</w:t>
+        <w:t xml:space="preserve">Refatorei com agentes de IA o caso de uso mais crítico do checkout, de 994 para 184 linhas, em 6 PRs protegidos por testes automatizados, separando as regras em funções testadas isoladamente.</w:t>
       </w:r>
     </w:p>
     <w:p>
@@ -521,7 +521,7 @@
           <w:sz w:val="20"/>
           <w:szCs w:val="20"/>
         </w:rPr>
-        <w:t xml:space="preserve">Refatorei com agentes de IA o caso de uso mais crítico do checkout, de 994 para 184 linhas, em 6 PRs protegidos por testes automatizados, separando as regras em funções testadas isoladamente.</w:t>
+        <w:t xml:space="preserve">Migrei o app do aluno de uma ferramenta no-code para a API própria, levando os dados legados do agendamento (906 horários e 457 agendamentos) e tirando a empresa da dependência do fornecedor.</w:t>
       </w:r>
     </w:p>
     <w:p>
@@ -752,7 +752,7 @@
         </w:rPr>
         <w:t xml:space="preserve">  -  </w:t>
       </w:r>
-      <w:hyperlink w:history="1" r:id="rIdhmixmadcupb_tdxfw0lrt">
+      <w:hyperlink w:history="1" r:id="rIdgtudnwrre0c7981omcrbv">
         <w:r>
           <w:rPr>
             <w:rFonts w:ascii="Arial" w:cs="Arial" w:eastAsia="Arial" w:hAnsi="Arial"/>
@@ -771,7 +771,7 @@
         </w:rPr>
         <w:t xml:space="preserve">  |  Demo: </w:t>
       </w:r>
-      <w:hyperlink w:history="1" r:id="rIddwietgkbywcdi_uo1gwin">
+      <w:hyperlink w:history="1" r:id="rId3dtxt2jg9ui0acd2sq33e">
         <w:r>
           <w:rPr>
             <w:rFonts w:ascii="Arial" w:cs="Arial" w:eastAsia="Arial" w:hAnsi="Arial"/>
@@ -799,7 +799,7 @@
           <w:sz w:val="20"/>
           <w:szCs w:val="20"/>
         </w:rPr>
-        <w:t xml:space="preserve">Gerenciador de tarefas em formato Kanban feito em Angular, com login e sessão que se renova sozinha; é o front-end da API em Java abaixo.</w:t>
+        <w:t xml:space="preserve">Kanban em Angular 20 com Signals, componentes standalone, design system próprio e sessão que se renova sozinha, consumindo uma API REST em Java.</w:t>
       </w:r>
     </w:p>
     <w:p>
@@ -824,7 +824,7 @@
         </w:rPr>
         <w:t xml:space="preserve">  -  </w:t>
       </w:r>
-      <w:hyperlink w:history="1" r:id="rIdke80ihyesmk42d5njvjsb">
+      <w:hyperlink w:history="1" r:id="rIdhqtejbvugkghwmcf02dat">
         <w:r>
           <w:rPr>
             <w:rFonts w:ascii="Arial" w:cs="Arial" w:eastAsia="Arial" w:hAnsi="Arial"/>
@@ -852,7 +852,7 @@
           <w:sz w:val="20"/>
           <w:szCs w:val="20"/>
         </w:rPr>
-        <w:t xml:space="preserve">API em Java e Spring Boot do gerenciador de tarefas, com login social, e-mails automáticos e controle de acesso por membro.</w:t>
+        <w:t xml:space="preserve">API REST em Java 17 e Spring Boot com JWT e refresh token no Redis, login com Google, anexos direto no S3, testes com JUnit e Mockito e deploy automático na AWS.</w:t>
       </w:r>
     </w:p>
     <w:p>

</xml_diff>

<commit_message>
chore: CVs (PT e EN) com o 2º feedback de 23/10/2026
Resumo mais direto, sem 'sozinho' no bullet, termos mais claros e
categorias de competência com nomes mais claros.

Co-Authored-By: Claude Opus 5.5 <noreply@anthropic.com>
</commit_message>
<xml_diff>
--- a/curriculo/cv.docx
+++ b/curriculo/cv.docx
@@ -46,7 +46,7 @@
         </w:rPr>
         <w:t xml:space="preserve">Caratinga, MG  |  +55 33 99853-1528  |  </w:t>
       </w:r>
-      <w:hyperlink w:history="1" r:id="rIdmc4ytukwovjommrbjhji0">
+      <w:hyperlink w:history="1" r:id="rIdhyjie5vqobagg0ww_2nyv">
         <w:r>
           <w:rPr>
             <w:rFonts w:ascii="Arial" w:cs="Arial" w:eastAsia="Arial" w:hAnsi="Arial"/>
@@ -71,7 +71,7 @@
         </w:rPr>
         <w:t xml:space="preserve">Portfólio: </w:t>
       </w:r>
-      <w:hyperlink w:history="1" r:id="rIdfvn5vaqdpvu781fm2tjuy">
+      <w:hyperlink w:history="1" r:id="rIdhftbtwnh1zbo8gkvddk2c">
         <w:r>
           <w:rPr>
             <w:rFonts w:ascii="Arial" w:cs="Arial" w:eastAsia="Arial" w:hAnsi="Arial"/>
@@ -90,7 +90,7 @@
         </w:rPr>
         <w:t xml:space="preserve">  |  LinkedIn: </w:t>
       </w:r>
-      <w:hyperlink w:history="1" r:id="rIdhecrurpudygsfy1c8kntg">
+      <w:hyperlink w:history="1" r:id="rIdijzgbmrtmzxtjlr_ytukr">
         <w:r>
           <w:rPr>
             <w:rFonts w:ascii="Arial" w:cs="Arial" w:eastAsia="Arial" w:hAnsi="Arial"/>
@@ -109,7 +109,7 @@
         </w:rPr>
         <w:t xml:space="preserve">  |  GitHub: </w:t>
       </w:r>
-      <w:hyperlink w:history="1" r:id="rIdrz5dg2v1rc2n-54azzgpa">
+      <w:hyperlink w:history="1" r:id="rIdid33z7giwdx-_9fu8-1fn">
         <w:r>
           <w:rPr>
             <w:rFonts w:ascii="Arial" w:cs="Arial" w:eastAsia="Arial" w:hAnsi="Arial"/>
@@ -151,7 +151,7 @@
           <w:sz w:val="20"/>
           <w:szCs w:val="20"/>
         </w:rPr>
-        <w:t xml:space="preserve">Desenvolvedor Full Stack com experiência no desenvolvimento e na evolução de produtos digitais em produção. Trabalho com Node.js e React no dia a dia e com Java/Spring Boot e Angular em projetos próprios, da implementação aos testes e à publicação, usando IA como apoio e revisando o resultado.</w:t>
+        <w:t xml:space="preserve">Desenvolvedor Full Stack com experiência em produtos digitais em produção, principalmente com Node.js e React. Desenvolvo APIs, interfaces e integrações, da implementação aos testes e à publicação. Também desenvolvo projetos pessoais com Java/Spring Boot e Angular e uso IA como apoio, revisando o resultado.</w:t>
       </w:r>
     </w:p>
     <w:p>
@@ -255,7 +255,7 @@
           <w:sz w:val="20"/>
           <w:szCs w:val="20"/>
         </w:rPr>
-        <w:t xml:space="preserve">Dados: </w:t>
+        <w:t xml:space="preserve">Banco de dados e cache: </w:t>
       </w:r>
       <w:r>
         <w:rPr>
@@ -278,15 +278,15 @@
           <w:sz w:val="20"/>
           <w:szCs w:val="20"/>
         </w:rPr>
-        <w:t xml:space="preserve">Cloud e DevOps: </w:t>
-      </w:r>
-      <w:r>
-        <w:rPr>
-          <w:rFonts w:ascii="Arial" w:cs="Arial" w:eastAsia="Arial" w:hAnsi="Arial"/>
-          <w:sz w:val="20"/>
-          <w:szCs w:val="20"/>
-        </w:rPr>
-        <w:t xml:space="preserve">AWS (EC2, RDS, S3, SES), Docker, GitHub Actions (CI/CD), Sentry, Monorepo (Turborepo)</w:t>
+        <w:t xml:space="preserve">Cloud, DevOps e observabilidade: </w:t>
+      </w:r>
+      <w:r>
+        <w:rPr>
+          <w:rFonts w:ascii="Arial" w:cs="Arial" w:eastAsia="Arial" w:hAnsi="Arial"/>
+          <w:sz w:val="20"/>
+          <w:szCs w:val="20"/>
+        </w:rPr>
+        <w:t xml:space="preserve">AWS (EC2, RDS, S3, SES), Docker, GitHub Actions (CI/CD), Sentry</w:t>
       </w:r>
     </w:p>
     <w:p>
@@ -332,7 +332,7 @@
           <w:sz w:val="20"/>
           <w:szCs w:val="20"/>
         </w:rPr>
-        <w:t xml:space="preserve">Git, Scrum, Claude Code</w:t>
+        <w:t xml:space="preserve">Git, Scrum, Claude Code, GitHub Copilot</w:t>
       </w:r>
     </w:p>
     <w:p>
@@ -426,7 +426,7 @@
           <w:sz w:val="20"/>
           <w:szCs w:val="20"/>
         </w:rPr>
-        <w:t xml:space="preserve">Desenvolvi sozinho a API central e as 3 aplicações para alunos, professores e equipe, levando a plataforma de educação à produção.</w:t>
+        <w:t xml:space="preserve">Desenvolvi a API central e as 3 aplicações para alunos, professores e equipe, levando a plataforma de educação à produção.</w:t>
       </w:r>
     </w:p>
     <w:p>
@@ -483,7 +483,7 @@
           <w:sz w:val="20"/>
           <w:szCs w:val="20"/>
         </w:rPr>
-        <w:t xml:space="preserve">Desenvolvi a venda assistida (link público com QR Code PIX e validação de comprovante), que permite vender pelo WhatsApp sem o comprador ter cartão na hora.</w:t>
+        <w:t xml:space="preserve">Desenvolvi a venda assistida pelo WhatsApp com pagamento via PIX (link público com QR Code e validação de comprovante).</w:t>
       </w:r>
     </w:p>
     <w:p>
@@ -752,7 +752,7 @@
         </w:rPr>
         <w:t xml:space="preserve">  -  </w:t>
       </w:r>
-      <w:hyperlink w:history="1" r:id="rIdgtudnwrre0c7981omcrbv">
+      <w:hyperlink w:history="1" r:id="rIdp7imjdu3jlhf641_ygqor">
         <w:r>
           <w:rPr>
             <w:rFonts w:ascii="Arial" w:cs="Arial" w:eastAsia="Arial" w:hAnsi="Arial"/>
@@ -771,7 +771,7 @@
         </w:rPr>
         <w:t xml:space="preserve">  |  Demo: </w:t>
       </w:r>
-      <w:hyperlink w:history="1" r:id="rId3dtxt2jg9ui0acd2sq33e">
+      <w:hyperlink w:history="1" r:id="rId9hq153_bfozsfyyfkm5vz">
         <w:r>
           <w:rPr>
             <w:rFonts w:ascii="Arial" w:cs="Arial" w:eastAsia="Arial" w:hAnsi="Arial"/>
@@ -799,7 +799,7 @@
           <w:sz w:val="20"/>
           <w:szCs w:val="20"/>
         </w:rPr>
-        <w:t xml:space="preserve">Kanban em Angular 20 com Signals, componentes standalone, design system próprio e sessão que se renova sozinha, consumindo uma API REST em Java.</w:t>
+        <w:t xml:space="preserve">Kanban em Angular 20 com Signals, componentes standalone, design system próprio e renovação automática de sessão, consumindo uma API REST em Java.</w:t>
       </w:r>
     </w:p>
     <w:p>
@@ -824,7 +824,7 @@
         </w:rPr>
         <w:t xml:space="preserve">  -  </w:t>
       </w:r>
-      <w:hyperlink w:history="1" r:id="rIdhqtejbvugkghwmcf02dat">
+      <w:hyperlink w:history="1" r:id="rIdhhdjq2kgnsqbty8nj_vio">
         <w:r>
           <w:rPr>
             <w:rFonts w:ascii="Arial" w:cs="Arial" w:eastAsia="Arial" w:hAnsi="Arial"/>

</xml_diff>

<commit_message>
chore: CVs com a categoria 'ORM e migrações' (3º feedback de 23/10/2026)
Co-Authored-By: Claude Opus 5.5 <noreply@anthropic.com>
</commit_message>
<xml_diff>
--- a/curriculo/cv.docx
+++ b/curriculo/cv.docx
@@ -46,7 +46,7 @@
         </w:rPr>
         <w:t xml:space="preserve">Caratinga, MG  |  +55 33 99853-1528  |  </w:t>
       </w:r>
-      <w:hyperlink w:history="1" r:id="rIdhyjie5vqobagg0ww_2nyv">
+      <w:hyperlink w:history="1" r:id="rIdko7w4gqmmzdx1lp1w64m5">
         <w:r>
           <w:rPr>
             <w:rFonts w:ascii="Arial" w:cs="Arial" w:eastAsia="Arial" w:hAnsi="Arial"/>
@@ -71,7 +71,7 @@
         </w:rPr>
         <w:t xml:space="preserve">Portfólio: </w:t>
       </w:r>
-      <w:hyperlink w:history="1" r:id="rIdhftbtwnh1zbo8gkvddk2c">
+      <w:hyperlink w:history="1" r:id="rIdouqxuqkmckjttqdyg2hki">
         <w:r>
           <w:rPr>
             <w:rFonts w:ascii="Arial" w:cs="Arial" w:eastAsia="Arial" w:hAnsi="Arial"/>
@@ -90,7 +90,7 @@
         </w:rPr>
         <w:t xml:space="preserve">  |  LinkedIn: </w:t>
       </w:r>
-      <w:hyperlink w:history="1" r:id="rIdijzgbmrtmzxtjlr_ytukr">
+      <w:hyperlink w:history="1" r:id="rId6q3lvlqwxacv0npqgtqqa">
         <w:r>
           <w:rPr>
             <w:rFonts w:ascii="Arial" w:cs="Arial" w:eastAsia="Arial" w:hAnsi="Arial"/>
@@ -109,7 +109,7 @@
         </w:rPr>
         <w:t xml:space="preserve">  |  GitHub: </w:t>
       </w:r>
-      <w:hyperlink w:history="1" r:id="rIdid33z7giwdx-_9fu8-1fn">
+      <w:hyperlink w:history="1" r:id="rIdgipynv_fragewiw7umycx">
         <w:r>
           <w:rPr>
             <w:rFonts w:ascii="Arial" w:cs="Arial" w:eastAsia="Arial" w:hAnsi="Arial"/>
@@ -240,7 +240,7 @@
           <w:sz w:val="20"/>
           <w:szCs w:val="20"/>
         </w:rPr>
-        <w:t xml:space="preserve">Node.js, NestJS, APIs REST, Spring Boot, Spring Data JPA</w:t>
+        <w:t xml:space="preserve">Node.js, NestJS, APIs REST, Spring Boot, Spring Security</w:t>
       </w:r>
     </w:p>
     <w:p>
@@ -263,7 +263,7 @@
           <w:sz w:val="20"/>
           <w:szCs w:val="20"/>
         </w:rPr>
-        <w:t xml:space="preserve">PostgreSQL, Prisma, Flyway, Redis</w:t>
+        <w:t xml:space="preserve">PostgreSQL, Redis</w:t>
       </w:r>
     </w:p>
     <w:p>
@@ -278,6 +278,29 @@
           <w:sz w:val="20"/>
           <w:szCs w:val="20"/>
         </w:rPr>
+        <w:t xml:space="preserve">ORM e migrações: </w:t>
+      </w:r>
+      <w:r>
+        <w:rPr>
+          <w:rFonts w:ascii="Arial" w:cs="Arial" w:eastAsia="Arial" w:hAnsi="Arial"/>
+          <w:sz w:val="20"/>
+          <w:szCs w:val="20"/>
+        </w:rPr>
+        <w:t xml:space="preserve">Spring Data JPA, Hibernate, Prisma, Flyway</w:t>
+      </w:r>
+    </w:p>
+    <w:p>
+      <w:pPr>
+        <w:spacing w:after="28"/>
+      </w:pPr>
+      <w:r>
+        <w:rPr>
+          <w:rFonts w:ascii="Arial" w:cs="Arial" w:eastAsia="Arial" w:hAnsi="Arial"/>
+          <w:b/>
+          <w:bCs/>
+          <w:sz w:val="20"/>
+          <w:szCs w:val="20"/>
+        </w:rPr>
         <w:t xml:space="preserve">Cloud, DevOps e observabilidade: </w:t>
       </w:r>
       <w:r>
@@ -309,7 +332,7 @@
           <w:sz w:val="20"/>
           <w:szCs w:val="20"/>
         </w:rPr>
-        <w:t xml:space="preserve">testes unitários e de integração, Jest, Vitest, JUnit 5, Mockito, code review</w:t>
+        <w:t xml:space="preserve">testes unitários e de integração, Jest, Vitest, JUnit 5, code review</w:t>
       </w:r>
     </w:p>
     <w:p>
@@ -332,7 +355,7 @@
           <w:sz w:val="20"/>
           <w:szCs w:val="20"/>
         </w:rPr>
-        <w:t xml:space="preserve">Git, Scrum, Claude Code, GitHub Copilot</w:t>
+        <w:t xml:space="preserve">Git, Scrum, Claude Code</w:t>
       </w:r>
     </w:p>
     <w:p>
@@ -752,7 +775,7 @@
         </w:rPr>
         <w:t xml:space="preserve">  -  </w:t>
       </w:r>
-      <w:hyperlink w:history="1" r:id="rIdp7imjdu3jlhf641_ygqor">
+      <w:hyperlink w:history="1" r:id="rIdssev8jxnx3iytzedwpr9-">
         <w:r>
           <w:rPr>
             <w:rFonts w:ascii="Arial" w:cs="Arial" w:eastAsia="Arial" w:hAnsi="Arial"/>
@@ -771,7 +794,7 @@
         </w:rPr>
         <w:t xml:space="preserve">  |  Demo: </w:t>
       </w:r>
-      <w:hyperlink w:history="1" r:id="rId9hq153_bfozsfyyfkm5vz">
+      <w:hyperlink w:history="1" r:id="rId_7jq4d0xngiclddly8hk0">
         <w:r>
           <w:rPr>
             <w:rFonts w:ascii="Arial" w:cs="Arial" w:eastAsia="Arial" w:hAnsi="Arial"/>
@@ -824,7 +847,7 @@
         </w:rPr>
         <w:t xml:space="preserve">  -  </w:t>
       </w:r>
-      <w:hyperlink w:history="1" r:id="rIdhhdjq2kgnsqbty8nj_vio">
+      <w:hyperlink w:history="1" r:id="rIdocat3drpugvwtni1i9kzu">
         <w:r>
           <w:rPr>
             <w:rFonts w:ascii="Arial" w:cs="Arial" w:eastAsia="Arial" w:hAnsi="Arial"/>
@@ -964,7 +987,7 @@
     </w:p>
     <w:sectPr>
       <w:pgSz w:w="11906" w:h="16838" w:orient="portrait"/>
-      <w:pgMar w:top="800" w:right="800" w:bottom="800" w:left="800" w:header="708" w:footer="708" w:gutter="0"/>
+      <w:pgMar w:top="720" w:right="720" w:bottom="720" w:left="720" w:header="708" w:footer="708" w:gutter="0"/>
       <w:pgNumType/>
       <w:docGrid w:linePitch="360"/>
     </w:sectPr>

</xml_diff>

<commit_message>
chore: CVs com os números conferidos na develop do oSeuMáximo
Testes 'mais de 650' (654 na develop), cobrança com o gateway de cada meio,
venda assistida com conferência do comprovante no painel e os 906/457 como
dados do agendador.

Co-Authored-By: Claude Opus 5.5 <noreply@anthropic.com>
</commit_message>
<xml_diff>
--- a/curriculo/cv.docx
+++ b/curriculo/cv.docx
@@ -46,7 +46,7 @@
         </w:rPr>
         <w:t xml:space="preserve">Caratinga, MG  |  +55 33 99853-1528  |  </w:t>
       </w:r>
-      <w:hyperlink w:history="1" r:id="rIdko7w4gqmmzdx1lp1w64m5">
+      <w:hyperlink w:history="1" r:id="rIdhyorcmerd6shyft3ft-if">
         <w:r>
           <w:rPr>
             <w:rFonts w:ascii="Arial" w:cs="Arial" w:eastAsia="Arial" w:hAnsi="Arial"/>
@@ -71,7 +71,7 @@
         </w:rPr>
         <w:t xml:space="preserve">Portfólio: </w:t>
       </w:r>
-      <w:hyperlink w:history="1" r:id="rIdouqxuqkmckjttqdyg2hki">
+      <w:hyperlink w:history="1" r:id="rIdvhclrsfotll-ipfodwmbj">
         <w:r>
           <w:rPr>
             <w:rFonts w:ascii="Arial" w:cs="Arial" w:eastAsia="Arial" w:hAnsi="Arial"/>
@@ -90,7 +90,7 @@
         </w:rPr>
         <w:t xml:space="preserve">  |  LinkedIn: </w:t>
       </w:r>
-      <w:hyperlink w:history="1" r:id="rId6q3lvlqwxacv0npqgtqqa">
+      <w:hyperlink w:history="1" r:id="rIdwi08r6gpl6wgwhfsw4zkq">
         <w:r>
           <w:rPr>
             <w:rFonts w:ascii="Arial" w:cs="Arial" w:eastAsia="Arial" w:hAnsi="Arial"/>
@@ -109,7 +109,7 @@
         </w:rPr>
         <w:t xml:space="preserve">  |  GitHub: </w:t>
       </w:r>
-      <w:hyperlink w:history="1" r:id="rIdgipynv_fragewiw7umycx">
+      <w:hyperlink w:history="1" r:id="rIdlk_-v_dsujbfhqw4uk62y">
         <w:r>
           <w:rPr>
             <w:rFonts w:ascii="Arial" w:cs="Arial" w:eastAsia="Arial" w:hAnsi="Arial"/>
@@ -468,7 +468,7 @@
           <w:sz w:val="20"/>
           <w:szCs w:val="20"/>
         </w:rPr>
-        <w:t xml:space="preserve">Implementei a cobrança no Brasil com parcelamento em até 12x, PIX e boleto, e a assinatura recorrente internacional em moeda estrangeira, integrando 2 gateways (Stripe e InfinitePay).</w:t>
+        <w:t xml:space="preserve">Implementei a cobrança no Brasil com parcelamento em até 12x, PIX e boleto pela InfinitePay, e a assinatura recorrente internacional em USD, EUR e GBP pela Stripe.</w:t>
       </w:r>
     </w:p>
     <w:p>
@@ -506,7 +506,7 @@
           <w:sz w:val="20"/>
           <w:szCs w:val="20"/>
         </w:rPr>
-        <w:t xml:space="preserve">Desenvolvi a venda assistida pelo WhatsApp com pagamento via PIX (link público com QR Code e validação de comprovante).</w:t>
+        <w:t xml:space="preserve">Desenvolvi a venda assistida pelo WhatsApp com pagamento via PIX (link público com QR Code e conferência do comprovante no painel).</w:t>
       </w:r>
     </w:p>
     <w:p>
@@ -544,7 +544,7 @@
           <w:sz w:val="20"/>
           <w:szCs w:val="20"/>
         </w:rPr>
-        <w:t xml:space="preserve">Migrei o app do aluno de uma ferramenta no-code para a API própria, levando os dados legados do agendamento (906 horários e 457 agendamentos) e tirando a empresa da dependência do fornecedor.</w:t>
+        <w:t xml:space="preserve">Migrei o app do aluno de uma ferramenta no-code para a API própria e trouxe os dados do agendador de aulas ao vivo (906 horários e 457 agendamentos exportados), tirando a empresa da dependência do fornecedor.</w:t>
       </w:r>
     </w:p>
     <w:p>
@@ -775,7 +775,7 @@
         </w:rPr>
         <w:t xml:space="preserve">  -  </w:t>
       </w:r>
-      <w:hyperlink w:history="1" r:id="rIdssev8jxnx3iytzedwpr9-">
+      <w:hyperlink w:history="1" r:id="rIduc_eddqhfgwolomcl4r4b">
         <w:r>
           <w:rPr>
             <w:rFonts w:ascii="Arial" w:cs="Arial" w:eastAsia="Arial" w:hAnsi="Arial"/>
@@ -794,7 +794,7 @@
         </w:rPr>
         <w:t xml:space="preserve">  |  Demo: </w:t>
       </w:r>
-      <w:hyperlink w:history="1" r:id="rId_7jq4d0xngiclddly8hk0">
+      <w:hyperlink w:history="1" r:id="rIdrtloeitidoznaoefelnxq">
         <w:r>
           <w:rPr>
             <w:rFonts w:ascii="Arial" w:cs="Arial" w:eastAsia="Arial" w:hAnsi="Arial"/>
@@ -847,7 +847,7 @@
         </w:rPr>
         <w:t xml:space="preserve">  -  </w:t>
       </w:r>
-      <w:hyperlink w:history="1" r:id="rIdocat3drpugvwtni1i9kzu">
+      <w:hyperlink w:history="1" r:id="rIdxszihpo87izcf2redu-fd">
         <w:r>
           <w:rPr>
             <w:rFonts w:ascii="Arial" w:cs="Arial" w:eastAsia="Arial" w:hAnsi="Arial"/>

</xml_diff>